<commit_message>
Simulation document: Gaussian 16 for final runs; earlier laptop run listed as Gaussian job; README note
Co-Authored-By: Claude Sonnet 5.5 <noreply@anthropic.com>
</commit_message>
<xml_diff>
--- a/SERS_Sepsis_Spectral_Library/Simulation_Methods_and_Spectra_NAM_LPS_LTA.docx
+++ b/SERS_Sepsis_Spectral_Library/Simulation_Methods_and_Spectra_NAM_LPS_LTA.docx
@@ -264,12 +264,13 @@
             <w:tcW w:type="dxa" w:w="2608"/>
           </w:tcPr>
           <w:p>
-            <w:r/>
+            <w:r>
+              <w:t>Gaussian 16 Rev C.01</w:t>
+            </w:r>
             <w:r>
               <w:rPr>
                 <w:sz w:val="17"/>
               </w:rPr>
-              <w:t>Gaussian 16 Rev C.01 (final); Gaussian 09 Rev D.01 (earlier runs)</w:t>
             </w:r>
           </w:p>
         </w:tc>
@@ -761,50 +762,6 @@
                 <w:sz w:val="17"/>
               </w:rPr>
               <w:t>Revision C.01, EM64W-G16RevC.01, build date 30-May-2019, Windows 64-bit</w:t>
-            </w:r>
-          </w:p>
-        </w:tc>
-      </w:tr>
-      <w:tr>
-        <w:tc>
-          <w:tcPr>
-            <w:tcW w:type="dxa" w:w="1928"/>
-          </w:tcPr>
-          <w:p>
-            <w:r/>
-            <w:r>
-              <w:rPr>
-                <w:sz w:val="17"/>
-              </w:rPr>
-              <w:t>Gaussian 09</w:t>
-            </w:r>
-          </w:p>
-        </w:tc>
-        <w:tc>
-          <w:tcPr>
-            <w:tcW w:type="dxa" w:w="3969"/>
-          </w:tcPr>
-          <w:p>
-            <w:r/>
-            <w:r>
-              <w:rPr>
-                <w:sz w:val="17"/>
-              </w:rPr>
-              <w:t>Earlier NAM runs and the failed whole-LTA attempt</w:t>
-            </w:r>
-          </w:p>
-        </w:tc>
-        <w:tc>
-          <w:tcPr>
-            <w:tcW w:type="dxa" w:w="4309"/>
-          </w:tcPr>
-          <w:p>
-            <w:r/>
-            <w:r>
-              <w:rPr>
-                <w:sz w:val="17"/>
-              </w:rPr>
-              <w:t>Revision D.01, IA32W-G09RevD.01, 24-Apr-2013</w:t>
             </w:r>
           </w:p>
         </w:tc>
@@ -1396,7 +1353,7 @@
               <w:rPr>
                 <w:sz w:val="17"/>
               </w:rPr>
-              <w:t>NAM earlier run, Gaussian 09 (6-311+G(d,p)), laptop</w:t>
+              <w:t>NAM earlier run (6-311+G(d,p)), laptop</w:t>
             </w:r>
           </w:p>
         </w:tc>
@@ -1548,7 +1505,7 @@
         <w:pStyle w:val="Heading2"/>
       </w:pPr>
       <w:r>
-        <w:t>4.2 The four calculations that exist</w:t>
+        <w:t>4.2 The calculations that exist</w:t>
       </w:r>
     </w:p>
     <w:tbl>
@@ -1650,11 +1607,13 @@
         <w:tc>
           <w:tcPr>
             <w:tcW w:type="dxa" w:w="1134"/>
+            <w:shd w:val="clear" w:color="auto" w:fill="D9D9D9"/>
           </w:tcPr>
           <w:p>
             <w:r/>
             <w:r>
               <w:rPr>
+                <w:b/>
                 <w:sz w:val="17"/>
               </w:rPr>
               <w:t>A</w:t>
@@ -1664,25 +1623,29 @@
         <w:tc>
           <w:tcPr>
             <w:tcW w:type="dxa" w:w="3572"/>
+            <w:shd w:val="clear" w:color="auto" w:fill="D9D9D9"/>
           </w:tcPr>
           <w:p>
             <w:r/>
             <w:r>
               <w:rPr>
+                <w:b/>
                 <w:sz w:val="17"/>
               </w:rPr>
-              <w:t>Gaussian 09 D.01, B3LYP/6-311+G(d,p), opt freq=raman (PubChem conformer, laptop)</w:t>
+              <w:t>Gaussian, B3LYP/6-311+G(d,p), opt freq=raman (PubChem conformer, run on a laptop)</w:t>
             </w:r>
           </w:p>
         </w:tc>
         <w:tc>
           <w:tcPr>
             <w:tcW w:type="dxa" w:w="680"/>
+            <w:shd w:val="clear" w:color="auto" w:fill="D9D9D9"/>
           </w:tcPr>
           <w:p>
             <w:r/>
             <w:r>
               <w:rPr>
+                <w:b/>
                 <w:sz w:val="17"/>
               </w:rPr>
               <w:t>39</w:t>
@@ -1692,11 +1655,13 @@
         <w:tc>
           <w:tcPr>
             <w:tcW w:type="dxa" w:w="3288"/>
+            <w:shd w:val="clear" w:color="auto" w:fill="D9D9D9"/>
           </w:tcPr>
           <w:p>
             <w:r/>
             <w:r>
               <w:rPr>
+                <w:b/>
                 <w:sz w:val="17"/>
               </w:rPr>
               <w:t>Normal termination (x2); CPU time about 19 h</w:t>
@@ -1706,11 +1671,13 @@
         <w:tc>
           <w:tcPr>
             <w:tcW w:type="dxa" w:w="1531"/>
+            <w:shd w:val="clear" w:color="auto" w:fill="D9D9D9"/>
           </w:tcPr>
           <w:p>
             <w:r/>
             <w:r>
               <w:rPr>
+                <w:b/>
                 <w:sz w:val="17"/>
               </w:rPr>
               <w:t>Early run; not used</w:t>
@@ -4300,12 +4267,13 @@
             <w:tcW w:type="dxa" w:w="5783"/>
           </w:tcPr>
           <w:p>
-            <w:r/>
+            <w:r>
+              <w:t>A Gaussian job on a structure titled 137349712 (probably a PubChem CID, not confirmed; 124 atoms, C39 H70 N2 O13) at B3LYP/6-311++G(d,p) stopped after 2 seconds on 9 Feb 2026 with "Atoms too close" (two atoms 0.295 angstrom apart). The input coordinates are flat (z = 0.0 for all 124 atoms), i.e. a 2D drawing, not a 3D structure. No repeated attempt was found.</w:t>
+            </w:r>
             <w:r>
               <w:rPr>
                 <w:sz w:val="17"/>
               </w:rPr>
-              <w:t>A Gaussian 09 job on a structure titled 137349712 (probably a PubChem CID, not confirmed; 124 atoms, C39 H70 N2 O13) at B3LYP/6-311++G(d,p) stopped after 2 seconds on 9 Feb 2026 with "Atoms too close" (two atoms 0.295 angstrom apart). The input coordinates are flat (z = 0.0 for all 124 atoms), i.e. a 2D drawing, not a 3D structure. No repeated attempt was found.</w:t>
             </w:r>
           </w:p>
         </w:tc>

</xml_diff>